<commit_message>
update papers and dates for ASTRO
</commit_message>
<xml_diff>
--- a/Clincal_CV/BMAnderson CV.docx
+++ b/Clincal_CV/BMAnderson CV.docx
@@ -1,6 +1,6 @@
 
 <file path=word/document.xml><?xml version="1.0" encoding="utf-8"?>
-<w:document xmlns:wpc="http://schemas.microsoft.com/office/word/2010/wordprocessingCanvas" xmlns:cx="http://schemas.microsoft.com/office/drawing/2014/chartex" xmlns:cx1="http://schemas.microsoft.com/office/drawing/2015/9/8/chartex" xmlns:cx2="http://schemas.microsoft.com/office/drawing/2015/10/21/chartex" xmlns:cx3="http://schemas.microsoft.com/office/drawing/2016/5/9/chartex" xmlns:cx4="http://schemas.microsoft.com/office/drawing/2016/5/10/chartex" xmlns:cx5="http://schemas.microsoft.com/office/drawing/2016/5/11/chartex" xmlns:cx6="http://schemas.microsoft.com/office/drawing/2016/5/12/chartex" xmlns:cx7="http://schemas.microsoft.com/office/drawing/2016/5/13/chartex" xmlns:cx8="http://schemas.microsoft.com/office/drawing/2016/5/14/chartex" xmlns:mc="http://schemas.openxmlformats.org/markup-compatibility/2006" xmlns:aink="http://schemas.microsoft.com/office/drawing/2016/ink" xmlns:am3d="http://schemas.microsoft.com/office/drawing/2017/model3d" xmlns:o="urn:schemas-microsoft-com:office:office" xmlns:oel="http://schemas.microsoft.com/office/2019/extlst" xmlns:r="http://schemas.openxmlformats.org/officeDocument/2006/relationships" xmlns:m="http://schemas.openxmlformats.org/officeDocument/2006/math" xmlns:v="urn:schemas-microsoft-com:vml" xmlns:wp14="http://schemas.microsoft.com/office/word/2010/wordprocessingDrawing" xmlns:wp="http://schemas.openxmlformats.org/drawingml/2006/wordprocessingDrawing" xmlns:w10="urn:schemas-microsoft-com:office:word" xmlns:w="http://schemas.openxmlformats.org/wordprocessingml/2006/main" xmlns:w14="http://schemas.microsoft.com/office/word/2010/wordml" xmlns:w15="http://schemas.microsoft.com/office/word/2012/wordml" xmlns:w16cei="http://schemas.microsoft.com/office/word/2026/wordml/cei" xmlns:w16cex="http://schemas.microsoft.com/office/word/2018/wordml/cex" xmlns:w16cid="http://schemas.microsoft.com/office/word/2016/wordml/cid" xmlns:w16="http://schemas.microsoft.com/office/word/2018/wordml" xmlns:w16du="http://schemas.microsoft.com/office/word/2023/wordml/word16du" xmlns:w16sdtdh="http://schemas.microsoft.com/office/word/2020/wordml/sdtdatahash" xmlns:w16sdtfl="http://schemas.microsoft.com/office/word/2024/wordml/sdtformatlock" xmlns:w16se="http://schemas.microsoft.com/office/word/2015/wordml/symex" xmlns:wpg="http://schemas.microsoft.com/office/word/2010/wordprocessingGroup" xmlns:wpi="http://schemas.microsoft.com/office/word/2010/wordprocessingInk" xmlns:wne="http://schemas.microsoft.com/office/word/2006/wordml" xmlns:wps="http://schemas.microsoft.com/office/word/2010/wordprocessingShape" mc:Ignorable="w14 w15 w16se w16cid w16 w16cex w16sdtdh w16sdtfl w16du wp14">
+<w:document xmlns:wpc="http://schemas.microsoft.com/office/word/2010/wordprocessingCanvas" xmlns:cx="http://schemas.microsoft.com/office/drawing/2014/chartex" xmlns:cx1="http://schemas.microsoft.com/office/drawing/2015/9/8/chartex" xmlns:cx2="http://schemas.microsoft.com/office/drawing/2015/10/21/chartex" xmlns:cx3="http://schemas.microsoft.com/office/drawing/2016/5/9/chartex" xmlns:cx4="http://schemas.microsoft.com/office/drawing/2016/5/10/chartex" xmlns:cx5="http://schemas.microsoft.com/office/drawing/2016/5/11/chartex" xmlns:cx6="http://schemas.microsoft.com/office/drawing/2016/5/12/chartex" xmlns:cx7="http://schemas.microsoft.com/office/drawing/2016/5/13/chartex" xmlns:cx8="http://schemas.microsoft.com/office/drawing/2016/5/14/chartex" xmlns:mc="http://schemas.openxmlformats.org/markup-compatibility/2006" xmlns:aink="http://schemas.microsoft.com/office/drawing/2016/ink" xmlns:am3d="http://schemas.microsoft.com/office/drawing/2017/model3d" xmlns:o="urn:schemas-microsoft-com:office:office" xmlns:oel="http://schemas.microsoft.com/office/2019/extlst" xmlns:r="http://schemas.openxmlformats.org/officeDocument/2006/relationships" xmlns:m="http://schemas.openxmlformats.org/officeDocument/2006/math" xmlns:v="urn:schemas-microsoft-com:vml" xmlns:wp14="http://schemas.microsoft.com/office/word/2010/wordprocessingDrawing" xmlns:wp="http://schemas.openxmlformats.org/drawingml/2006/wordprocessingDrawing" xmlns:w10="urn:schemas-microsoft-com:office:word" xmlns:w="http://schemas.openxmlformats.org/wordprocessingml/2006/main" xmlns:w14="http://schemas.microsoft.com/office/word/2010/wordml" xmlns:w15="http://schemas.microsoft.com/office/word/2012/wordml" xmlns:w16cex="http://schemas.microsoft.com/office/word/2018/wordml/cex" xmlns:w16cid="http://schemas.microsoft.com/office/word/2016/wordml/cid" xmlns:w16="http://schemas.microsoft.com/office/word/2018/wordml" xmlns:w16du="http://schemas.microsoft.com/office/word/2023/wordml/word16du" xmlns:w16sdtdh="http://schemas.microsoft.com/office/word/2020/wordml/sdtdatahash" xmlns:w16sdtfl="http://schemas.microsoft.com/office/word/2024/wordml/sdtformatlock" xmlns:w16se="http://schemas.microsoft.com/office/word/2015/wordml/symex" xmlns:wpg="http://schemas.microsoft.com/office/word/2010/wordprocessingGroup" xmlns:wpi="http://schemas.microsoft.com/office/word/2010/wordprocessingInk" xmlns:wne="http://schemas.microsoft.com/office/word/2006/wordml" xmlns:wps="http://schemas.microsoft.com/office/word/2010/wordprocessingShape" mc:Ignorable="w14 w15 w16se w16cid w16 w16cex w16sdtdh w16sdtfl w16du wp14">
   <w:body>
     <w:p>
       <w:pPr>
@@ -1935,12 +1935,15 @@
         </w:tabs>
         <w:spacing w:after="60"/>
         <w:ind w:left="1095" w:hanging="1095"/>
-      </w:pPr>
-      <w:r>
-        <w:rPr>
-          <w:rFonts w:ascii="Times New Roman" w:hAnsi="Times New Roman"/>
-        </w:rPr>
-        <w:t>2025</w:t>
+        <w:rPr>
+          <w:rFonts w:ascii="Times New Roman" w:hAnsi="Times New Roman"/>
+        </w:rPr>
+      </w:pPr>
+      <w:r>
+        <w:rPr>
+          <w:rFonts w:ascii="Times New Roman" w:hAnsi="Times New Roman"/>
+        </w:rPr>
+        <w:t>2026</w:t>
       </w:r>
       <w:r>
         <w:rPr>
@@ -1950,33 +1953,16 @@
       </w:r>
       <w:r>
         <w:rPr>
-          <w:rFonts w:ascii="Times New Roman" w:hAnsi="Times New Roman" w:cs="Times New Roman"/>
-          <w:color w:val="000000" w:themeColor="text1"/>
+          <w:rFonts w:ascii="Times New Roman" w:hAnsi="Times New Roman"/>
           <w:u w:val="single"/>
         </w:rPr>
-        <w:t>University of North Carolina, Chapel Hill Research Retreat</w:t>
-      </w:r>
-      <w:r>
-        <w:rPr>
-          <w:rFonts w:ascii="Times New Roman" w:hAnsi="Times New Roman" w:cs="Times New Roman"/>
-          <w:color w:val="000000" w:themeColor="text1"/>
-        </w:rPr>
-        <w:t>: 1</w:t>
-      </w:r>
-      <w:r>
-        <w:rPr>
-          <w:rFonts w:ascii="Times New Roman" w:hAnsi="Times New Roman" w:cs="Times New Roman"/>
-          <w:color w:val="000000" w:themeColor="text1"/>
-          <w:vertAlign w:val="superscript"/>
-        </w:rPr>
-        <w:t>st</w:t>
-      </w:r>
-      <w:r>
-        <w:rPr>
-          <w:rFonts w:ascii="Times New Roman" w:hAnsi="Times New Roman" w:cs="Times New Roman"/>
-          <w:color w:val="000000" w:themeColor="text1"/>
-        </w:rPr>
-        <w:t xml:space="preserve"> place poster in Physics/DHE Research</w:t>
+        <w:t>ASTRO Abstract Recognition Award</w:t>
+      </w:r>
+      <w:r>
+        <w:rPr>
+          <w:rFonts w:ascii="Times New Roman" w:hAnsi="Times New Roman"/>
+        </w:rPr>
+        <w:t>: Top scoring abstract, 49 selected of 2,200 submissions.</w:t>
       </w:r>
     </w:p>
     <w:p>
@@ -1991,7 +1977,7 @@
         <w:rPr>
           <w:rFonts w:ascii="Times New Roman" w:hAnsi="Times New Roman"/>
         </w:rPr>
-        <w:t>2022</w:t>
+        <w:t>2025</w:t>
       </w:r>
       <w:r>
         <w:rPr>
@@ -2005,14 +1991,29 @@
           <w:color w:val="000000" w:themeColor="text1"/>
           <w:u w:val="single"/>
         </w:rPr>
-        <w:t>AAPM Annual Meeting, Jack Krohmer Early Career Investigator Competition Winner</w:t>
-      </w:r>
-      <w:r>
-        <w:rPr>
-          <w:rFonts w:ascii="Times New Roman" w:hAnsi="Times New Roman" w:cs="Times New Roman"/>
-          <w:color w:val="000000" w:themeColor="text1"/>
-        </w:rPr>
-        <w:t xml:space="preserve"> – EPIDEEP: Predicting In-Vivo EPID Transit Images – a Deep Learning Approach</w:t>
+        <w:t>University of North Carolina, Chapel Hill Research Retreat</w:t>
+      </w:r>
+      <w:r>
+        <w:rPr>
+          <w:rFonts w:ascii="Times New Roman" w:hAnsi="Times New Roman" w:cs="Times New Roman"/>
+          <w:color w:val="000000" w:themeColor="text1"/>
+        </w:rPr>
+        <w:t>: 1</w:t>
+      </w:r>
+      <w:r>
+        <w:rPr>
+          <w:rFonts w:ascii="Times New Roman" w:hAnsi="Times New Roman" w:cs="Times New Roman"/>
+          <w:color w:val="000000" w:themeColor="text1"/>
+          <w:vertAlign w:val="superscript"/>
+        </w:rPr>
+        <w:t>st</w:t>
+      </w:r>
+      <w:r>
+        <w:rPr>
+          <w:rFonts w:ascii="Times New Roman" w:hAnsi="Times New Roman" w:cs="Times New Roman"/>
+          <w:color w:val="000000" w:themeColor="text1"/>
+        </w:rPr>
+        <w:t xml:space="preserve"> place poster in Physics/DHE Research</w:t>
       </w:r>
     </w:p>
     <w:p>
@@ -2041,28 +2042,14 @@
           <w:color w:val="000000" w:themeColor="text1"/>
           <w:u w:val="single"/>
         </w:rPr>
-        <w:t>MD Anderson, Alfred G. Knudson Jr. Outstanding Dissertation Award</w:t>
-      </w:r>
-      <w:r>
-        <w:rPr>
-          <w:rFonts w:ascii="Times New Roman" w:hAnsi="Times New Roman" w:cs="Times New Roman"/>
-          <w:color w:val="000000" w:themeColor="text1"/>
-        </w:rPr>
-        <w:t>: $5,000 Award established by MD Anderson Cancer Center to honor the late Dr. Knudson in recognition of top PhD dissertation</w:t>
-      </w:r>
-      <w:r>
-        <w:rPr>
-          <w:rFonts w:ascii="Times New Roman" w:hAnsi="Times New Roman" w:cs="Times New Roman"/>
-          <w:color w:val="000000" w:themeColor="text1"/>
-        </w:rPr>
-        <w:t>s</w:t>
-      </w:r>
-      <w:r>
-        <w:rPr>
-          <w:rFonts w:ascii="Times New Roman" w:hAnsi="Times New Roman" w:cs="Times New Roman"/>
-          <w:color w:val="000000" w:themeColor="text1"/>
-        </w:rPr>
-        <w:t>.</w:t>
+        <w:t>AAPM Annual Meeting, Jack Krohmer Early Career Investigator Competition Winner</w:t>
+      </w:r>
+      <w:r>
+        <w:rPr>
+          <w:rFonts w:ascii="Times New Roman" w:hAnsi="Times New Roman" w:cs="Times New Roman"/>
+          <w:color w:val="000000" w:themeColor="text1"/>
+        </w:rPr>
+        <w:t xml:space="preserve"> – EPIDEEP: Predicting In-Vivo EPID Transit Images – a Deep Learning Approach</w:t>
       </w:r>
     </w:p>
     <w:p>
@@ -2077,7 +2064,7 @@
         <w:rPr>
           <w:rFonts w:ascii="Times New Roman" w:hAnsi="Times New Roman"/>
         </w:rPr>
-        <w:t>2021</w:t>
+        <w:t>2022</w:t>
       </w:r>
       <w:r>
         <w:rPr>
@@ -2091,7 +2078,28 @@
           <w:color w:val="000000" w:themeColor="text1"/>
           <w:u w:val="single"/>
         </w:rPr>
-        <w:t>AAPM Practical Big Data Workshop, Early Career Investigator – Impact Award</w:t>
+        <w:t>MD Anderson, Alfred G. Knudson Jr. Outstanding Dissertation Award</w:t>
+      </w:r>
+      <w:r>
+        <w:rPr>
+          <w:rFonts w:ascii="Times New Roman" w:hAnsi="Times New Roman" w:cs="Times New Roman"/>
+          <w:color w:val="000000" w:themeColor="text1"/>
+        </w:rPr>
+        <w:t>: $5,000 Award established by MD Anderson Cancer Center to honor the late Dr. Knudson in recognition of top PhD dissertation</w:t>
+      </w:r>
+      <w:r>
+        <w:rPr>
+          <w:rFonts w:ascii="Times New Roman" w:hAnsi="Times New Roman" w:cs="Times New Roman"/>
+          <w:color w:val="000000" w:themeColor="text1"/>
+        </w:rPr>
+        <w:t>s</w:t>
+      </w:r>
+      <w:r>
+        <w:rPr>
+          <w:rFonts w:ascii="Times New Roman" w:hAnsi="Times New Roman" w:cs="Times New Roman"/>
+          <w:color w:val="000000" w:themeColor="text1"/>
+        </w:rPr>
+        <w:t>.</w:t>
       </w:r>
     </w:p>
     <w:p>
@@ -2106,7 +2114,7 @@
         <w:rPr>
           <w:rFonts w:ascii="Times New Roman" w:hAnsi="Times New Roman"/>
         </w:rPr>
-        <w:t>2019</w:t>
+        <w:t>2021</w:t>
       </w:r>
       <w:r>
         <w:rPr>
@@ -2120,31 +2128,7 @@
           <w:color w:val="000000" w:themeColor="text1"/>
           <w:u w:val="single"/>
         </w:rPr>
-        <w:t>MD Anderson, Association of Science Communication (ASC) Oral Competition 1</w:t>
-      </w:r>
-      <w:r>
-        <w:rPr>
-          <w:rFonts w:ascii="Times New Roman" w:hAnsi="Times New Roman" w:cs="Times New Roman"/>
-          <w:color w:val="000000" w:themeColor="text1"/>
-          <w:u w:val="single"/>
-          <w:vertAlign w:val="superscript"/>
-        </w:rPr>
-        <w:t>st</w:t>
-      </w:r>
-      <w:r>
-        <w:rPr>
-          <w:rFonts w:ascii="Times New Roman" w:hAnsi="Times New Roman" w:cs="Times New Roman"/>
-          <w:color w:val="000000" w:themeColor="text1"/>
-          <w:u w:val="single"/>
-        </w:rPr>
-        <w:t xml:space="preserve"> place</w:t>
-      </w:r>
-      <w:r>
-        <w:rPr>
-          <w:rFonts w:ascii="Times New Roman" w:hAnsi="Times New Roman" w:cs="Times New Roman"/>
-          <w:color w:val="000000" w:themeColor="text1"/>
-        </w:rPr>
-        <w:t>: ‘Why is scientific communication important?’</w:t>
+        <w:t>AAPM Practical Big Data Workshop, Early Career Investigator – Impact Award</w:t>
       </w:r>
     </w:p>
     <w:p>
@@ -2173,14 +2157,31 @@
           <w:color w:val="000000" w:themeColor="text1"/>
           <w:u w:val="single"/>
         </w:rPr>
-        <w:t>AAPM, Science Council Session</w:t>
-      </w:r>
-      <w:r>
-        <w:rPr>
-          <w:rFonts w:ascii="Times New Roman" w:hAnsi="Times New Roman" w:cs="Times New Roman"/>
-          <w:color w:val="000000" w:themeColor="text1"/>
-        </w:rPr>
-        <w:t xml:space="preserve"> “Deep Learning for Rapid Deformable Image Registration of Liver CT Scans”</w:t>
+        <w:t>MD Anderson, Association of Science Communication (ASC) Oral Competition 1</w:t>
+      </w:r>
+      <w:r>
+        <w:rPr>
+          <w:rFonts w:ascii="Times New Roman" w:hAnsi="Times New Roman" w:cs="Times New Roman"/>
+          <w:color w:val="000000" w:themeColor="text1"/>
+          <w:u w:val="single"/>
+          <w:vertAlign w:val="superscript"/>
+        </w:rPr>
+        <w:t>st</w:t>
+      </w:r>
+      <w:r>
+        <w:rPr>
+          <w:rFonts w:ascii="Times New Roman" w:hAnsi="Times New Roman" w:cs="Times New Roman"/>
+          <w:color w:val="000000" w:themeColor="text1"/>
+          <w:u w:val="single"/>
+        </w:rPr>
+        <w:t xml:space="preserve"> place</w:t>
+      </w:r>
+      <w:r>
+        <w:rPr>
+          <w:rFonts w:ascii="Times New Roman" w:hAnsi="Times New Roman" w:cs="Times New Roman"/>
+          <w:color w:val="000000" w:themeColor="text1"/>
+        </w:rPr>
+        <w:t>: ‘Why is scientific communication important?’</w:t>
       </w:r>
     </w:p>
     <w:p>
@@ -2195,7 +2196,7 @@
         <w:rPr>
           <w:rFonts w:ascii="Times New Roman" w:hAnsi="Times New Roman"/>
         </w:rPr>
-        <w:t>2018</w:t>
+        <w:t>2019</w:t>
       </w:r>
       <w:r>
         <w:rPr>
@@ -2209,14 +2210,14 @@
           <w:color w:val="000000" w:themeColor="text1"/>
           <w:u w:val="single"/>
         </w:rPr>
-        <w:t>AAPM, People’s Choice Award for Medical Physics Slam</w:t>
-      </w:r>
-      <w:r>
-        <w:rPr>
-          <w:rFonts w:ascii="Times New Roman" w:hAnsi="Times New Roman" w:cs="Times New Roman"/>
-          <w:color w:val="000000" w:themeColor="text1"/>
-        </w:rPr>
-        <w:t>: Monetary award for winning the people’s choice in presentation of research to a lay audience of non-medical physicists</w:t>
+        <w:t>AAPM, Science Council Session</w:t>
+      </w:r>
+      <w:r>
+        <w:rPr>
+          <w:rFonts w:ascii="Times New Roman" w:hAnsi="Times New Roman" w:cs="Times New Roman"/>
+          <w:color w:val="000000" w:themeColor="text1"/>
+        </w:rPr>
+        <w:t xml:space="preserve"> “Deep Learning for Rapid Deformable Image Registration of Liver CT Scans”</w:t>
       </w:r>
     </w:p>
     <w:p>
@@ -2245,31 +2246,14 @@
           <w:color w:val="000000" w:themeColor="text1"/>
           <w:u w:val="single"/>
         </w:rPr>
-        <w:t>Southwest AAPM, 1</w:t>
-      </w:r>
-      <w:r>
-        <w:rPr>
-          <w:rFonts w:ascii="Times New Roman" w:hAnsi="Times New Roman" w:cs="Times New Roman"/>
-          <w:color w:val="000000" w:themeColor="text1"/>
-          <w:u w:val="single"/>
-          <w:vertAlign w:val="superscript"/>
-        </w:rPr>
-        <w:t>st</w:t>
-      </w:r>
-      <w:r>
-        <w:rPr>
-          <w:rFonts w:ascii="Times New Roman" w:hAnsi="Times New Roman" w:cs="Times New Roman"/>
-          <w:color w:val="000000" w:themeColor="text1"/>
-          <w:u w:val="single"/>
-        </w:rPr>
-        <w:t xml:space="preserve"> Place Medical Physics Slam</w:t>
-      </w:r>
-      <w:r>
-        <w:rPr>
-          <w:rFonts w:ascii="Times New Roman" w:hAnsi="Times New Roman" w:cs="Times New Roman"/>
-          <w:color w:val="000000" w:themeColor="text1"/>
-        </w:rPr>
-        <w:t>: Challenge where students have 3 minutes to present their research to community members outside of the medical physics profession, received travel award to compete in the Medical Physics Slam in the annual meeting</w:t>
+        <w:t>AAPM, People’s Choice Award for Medical Physics Slam</w:t>
+      </w:r>
+      <w:r>
+        <w:rPr>
+          <w:rFonts w:ascii="Times New Roman" w:hAnsi="Times New Roman" w:cs="Times New Roman"/>
+          <w:color w:val="000000" w:themeColor="text1"/>
+        </w:rPr>
+        <w:t>: Monetary award for winning the people’s choice in presentation of research to a lay audience of non-medical physicists</w:t>
       </w:r>
     </w:p>
     <w:p>
@@ -2298,7 +2282,7 @@
           <w:color w:val="000000" w:themeColor="text1"/>
           <w:u w:val="single"/>
         </w:rPr>
-        <w:t>Southwest AAPM 1</w:t>
+        <w:t>Southwest AAPM, 1</w:t>
       </w:r>
       <w:r>
         <w:rPr>
@@ -2315,14 +2299,14 @@
           <w:color w:val="000000" w:themeColor="text1"/>
           <w:u w:val="single"/>
         </w:rPr>
-        <w:t xml:space="preserve"> Place Young Investigator Award</w:t>
-      </w:r>
-      <w:r>
-        <w:rPr>
-          <w:rFonts w:ascii="Times New Roman" w:hAnsi="Times New Roman" w:cs="Times New Roman"/>
-          <w:color w:val="000000" w:themeColor="text1"/>
-        </w:rPr>
-        <w:t>: Monetary award from SWAAPM chapter for best work presented at SWAAPM</w:t>
+        <w:t xml:space="preserve"> Place Medical Physics Slam</w:t>
+      </w:r>
+      <w:r>
+        <w:rPr>
+          <w:rFonts w:ascii="Times New Roman" w:hAnsi="Times New Roman" w:cs="Times New Roman"/>
+          <w:color w:val="000000" w:themeColor="text1"/>
+        </w:rPr>
+        <w:t>: Challenge where students have 3 minutes to present their research to community members outside of the medical physics profession, received travel award to compete in the Medical Physics Slam in the annual meeting</w:t>
       </w:r>
     </w:p>
     <w:p>
@@ -2351,28 +2335,31 @@
           <w:color w:val="000000" w:themeColor="text1"/>
           <w:u w:val="single"/>
         </w:rPr>
-        <w:t>Winter Institute of Medical Physics Early Career Medical Physicist Scholar</w:t>
-      </w:r>
-      <w:r>
-        <w:rPr>
-          <w:rFonts w:ascii="Times New Roman" w:hAnsi="Times New Roman" w:cs="Times New Roman"/>
-          <w:color w:val="000000" w:themeColor="text1"/>
-        </w:rPr>
-        <w:t xml:space="preserve">: </w:t>
-      </w:r>
-      <w:r>
-        <w:rPr>
-          <w:rFonts w:ascii="Times New Roman" w:hAnsi="Times New Roman" w:cs="Times New Roman"/>
-          <w:color w:val="000000" w:themeColor="text1"/>
-        </w:rPr>
-        <w:t>M</w:t>
-      </w:r>
-      <w:r>
-        <w:rPr>
-          <w:rFonts w:ascii="Times New Roman" w:hAnsi="Times New Roman" w:cs="Times New Roman"/>
-          <w:color w:val="000000" w:themeColor="text1"/>
-        </w:rPr>
-        <w:t>onetary award</w:t>
+        <w:t>Southwest AAPM 1</w:t>
+      </w:r>
+      <w:r>
+        <w:rPr>
+          <w:rFonts w:ascii="Times New Roman" w:hAnsi="Times New Roman" w:cs="Times New Roman"/>
+          <w:color w:val="000000" w:themeColor="text1"/>
+          <w:u w:val="single"/>
+          <w:vertAlign w:val="superscript"/>
+        </w:rPr>
+        <w:t>st</w:t>
+      </w:r>
+      <w:r>
+        <w:rPr>
+          <w:rFonts w:ascii="Times New Roman" w:hAnsi="Times New Roman" w:cs="Times New Roman"/>
+          <w:color w:val="000000" w:themeColor="text1"/>
+          <w:u w:val="single"/>
+        </w:rPr>
+        <w:t xml:space="preserve"> Place Young Investigator Award</w:t>
+      </w:r>
+      <w:r>
+        <w:rPr>
+          <w:rFonts w:ascii="Times New Roman" w:hAnsi="Times New Roman" w:cs="Times New Roman"/>
+          <w:color w:val="000000" w:themeColor="text1"/>
+        </w:rPr>
+        <w:t>: Monetary award from SWAAPM chapter for best work presented at SWAAPM</w:t>
       </w:r>
     </w:p>
     <w:p>
@@ -2387,7 +2374,7 @@
         <w:rPr>
           <w:rFonts w:ascii="Times New Roman" w:hAnsi="Times New Roman"/>
         </w:rPr>
-        <w:t>2017</w:t>
+        <w:t>2018</w:t>
       </w:r>
       <w:r>
         <w:rPr>
@@ -2401,31 +2388,28 @@
           <w:color w:val="000000" w:themeColor="text1"/>
           <w:u w:val="single"/>
         </w:rPr>
-        <w:t>MD Anderson, Summer Student Research Retreat, 2</w:t>
-      </w:r>
-      <w:r>
-        <w:rPr>
-          <w:rFonts w:ascii="Times New Roman" w:hAnsi="Times New Roman" w:cs="Times New Roman"/>
-          <w:color w:val="000000" w:themeColor="text1"/>
-          <w:u w:val="single"/>
-          <w:vertAlign w:val="superscript"/>
-        </w:rPr>
-        <w:t>nd</w:t>
-      </w:r>
-      <w:r>
-        <w:rPr>
-          <w:rFonts w:ascii="Times New Roman" w:hAnsi="Times New Roman" w:cs="Times New Roman"/>
-          <w:color w:val="000000" w:themeColor="text1"/>
-          <w:u w:val="single"/>
-        </w:rPr>
-        <w:t xml:space="preserve"> Place</w:t>
-      </w:r>
-      <w:r>
-        <w:rPr>
-          <w:rFonts w:ascii="Times New Roman" w:hAnsi="Times New Roman" w:cs="Times New Roman"/>
-          <w:color w:val="000000" w:themeColor="text1"/>
-        </w:rPr>
-        <w:t>: Students are invited to present their research for a monetary prize</w:t>
+        <w:t>Winter Institute of Medical Physics Early Career Medical Physicist Scholar</w:t>
+      </w:r>
+      <w:r>
+        <w:rPr>
+          <w:rFonts w:ascii="Times New Roman" w:hAnsi="Times New Roman" w:cs="Times New Roman"/>
+          <w:color w:val="000000" w:themeColor="text1"/>
+        </w:rPr>
+        <w:t xml:space="preserve">: </w:t>
+      </w:r>
+      <w:r>
+        <w:rPr>
+          <w:rFonts w:ascii="Times New Roman" w:hAnsi="Times New Roman" w:cs="Times New Roman"/>
+          <w:color w:val="000000" w:themeColor="text1"/>
+        </w:rPr>
+        <w:t>M</w:t>
+      </w:r>
+      <w:r>
+        <w:rPr>
+          <w:rFonts w:ascii="Times New Roman" w:hAnsi="Times New Roman" w:cs="Times New Roman"/>
+          <w:color w:val="000000" w:themeColor="text1"/>
+        </w:rPr>
+        <w:t>onetary award</w:t>
       </w:r>
     </w:p>
     <w:p>
@@ -2440,7 +2424,7 @@
         <w:rPr>
           <w:rFonts w:ascii="Times New Roman" w:hAnsi="Times New Roman"/>
         </w:rPr>
-        <w:t>2015</w:t>
+        <w:t>2017</w:t>
       </w:r>
       <w:r>
         <w:rPr>
@@ -2454,7 +2438,31 @@
           <w:color w:val="000000" w:themeColor="text1"/>
           <w:u w:val="single"/>
         </w:rPr>
-        <w:t>Georgia Institute of Technology, Graduation with Highest Honors</w:t>
+        <w:t>MD Anderson, Summer Student Research Retreat, 2</w:t>
+      </w:r>
+      <w:r>
+        <w:rPr>
+          <w:rFonts w:ascii="Times New Roman" w:hAnsi="Times New Roman" w:cs="Times New Roman"/>
+          <w:color w:val="000000" w:themeColor="text1"/>
+          <w:u w:val="single"/>
+          <w:vertAlign w:val="superscript"/>
+        </w:rPr>
+        <w:t>nd</w:t>
+      </w:r>
+      <w:r>
+        <w:rPr>
+          <w:rFonts w:ascii="Times New Roman" w:hAnsi="Times New Roman" w:cs="Times New Roman"/>
+          <w:color w:val="000000" w:themeColor="text1"/>
+          <w:u w:val="single"/>
+        </w:rPr>
+        <w:t xml:space="preserve"> Place</w:t>
+      </w:r>
+      <w:r>
+        <w:rPr>
+          <w:rFonts w:ascii="Times New Roman" w:hAnsi="Times New Roman" w:cs="Times New Roman"/>
+          <w:color w:val="000000" w:themeColor="text1"/>
+        </w:rPr>
+        <w:t>: Students are invited to present their research for a monetary prize</w:t>
       </w:r>
     </w:p>
     <w:p>
@@ -2469,6 +2477,35 @@
         <w:rPr>
           <w:rFonts w:ascii="Times New Roman" w:hAnsi="Times New Roman"/>
         </w:rPr>
+        <w:t>2015</w:t>
+      </w:r>
+      <w:r>
+        <w:rPr>
+          <w:rFonts w:ascii="Times New Roman" w:hAnsi="Times New Roman"/>
+        </w:rPr>
+        <w:tab/>
+      </w:r>
+      <w:r>
+        <w:rPr>
+          <w:rFonts w:ascii="Times New Roman" w:hAnsi="Times New Roman" w:cs="Times New Roman"/>
+          <w:color w:val="000000" w:themeColor="text1"/>
+          <w:u w:val="single"/>
+        </w:rPr>
+        <w:t>Georgia Institute of Technology, Graduation with Highest Honors</w:t>
+      </w:r>
+    </w:p>
+    <w:p>
+      <w:pPr>
+        <w:tabs>
+          <w:tab w:val="left" w:pos="1095"/>
+        </w:tabs>
+        <w:spacing w:after="60"/>
+        <w:ind w:left="1095" w:hanging="1095"/>
+      </w:pPr>
+      <w:r>
+        <w:rPr>
+          <w:rFonts w:ascii="Times New Roman" w:hAnsi="Times New Roman"/>
+        </w:rPr>
         <w:t>2014</w:t>
       </w:r>
       <w:r>
@@ -2598,7 +2635,15 @@
           <w:rFonts w:ascii="Times New Roman" w:hAnsi="Times New Roman" w:cs="Times New Roman"/>
           <w:color w:val="000000" w:themeColor="text1"/>
         </w:rPr>
-        <w:t>Created a new data architecture which represents all aspects of a patient’s radiation plan (dose-volume histograms, region-of-interest volumes, treatment beams, modalities) in a dramatically compressed form. This architecture facilitates rapid information gathering for curating a specific dataset and answering clinical questions.</w:t>
+        <w:t xml:space="preserve">Created a new data architecture which represents all aspects of a patient’s radiation plan (dose-volume histograms, region-of-interest volumes, treatment beams, modalities) in a dramatically compressed form. This architecture </w:t>
+      </w:r>
+      <w:r>
+        <w:rPr>
+          <w:rFonts w:ascii="Times New Roman" w:hAnsi="Times New Roman" w:cs="Times New Roman"/>
+          <w:color w:val="000000" w:themeColor="text1"/>
+        </w:rPr>
+        <w:lastRenderedPageBreak/>
+        <w:t>facilitates rapid information gathering for curating a specific dataset and answering clinical questions.</w:t>
       </w:r>
     </w:p>
     <w:p>
@@ -2611,7 +2656,6 @@
           <w:b/>
           <w:u w:val="single"/>
         </w:rPr>
-        <w:lastRenderedPageBreak/>
         <w:t>MD Anderson Cancer Center</w:t>
       </w:r>
     </w:p>
@@ -3171,6 +3215,13 @@
       <w:r>
         <w:rPr>
           <w:rFonts w:ascii="Times New Roman" w:hAnsi="Times New Roman" w:cs="Times New Roman"/>
+          <w:color w:val="000000" w:themeColor="text1"/>
+        </w:rPr>
+        <w:t xml:space="preserve">Gao Y., Wells D., Bhattacharya S., Repka M., Lavrova L., </w:t>
+      </w:r>
+      <w:r>
+        <w:rPr>
+          <w:rFonts w:ascii="Times New Roman" w:hAnsi="Times New Roman" w:cs="Times New Roman"/>
           <w:b/>
           <w:bCs/>
           <w:color w:val="000000" w:themeColor="text1"/>
@@ -3182,7 +3233,15 @@
           <w:rFonts w:ascii="Times New Roman" w:hAnsi="Times New Roman" w:cs="Times New Roman"/>
           <w:color w:val="000000" w:themeColor="text1"/>
         </w:rPr>
-        <w:t xml:space="preserve">, Repka M, Gao Y, Byrd E, McGurk R, Das S, Arcot R, Bhattacharya S, Adapa K, Wright J, Marks L, Mazur L. </w:t>
+        <w:t xml:space="preserve">., Das S., Rajasekar A., Byrd E., </w:t>
+      </w:r>
+      <w:r>
+        <w:rPr>
+          <w:rFonts w:ascii="Times New Roman" w:hAnsi="Times New Roman" w:cs="Times New Roman"/>
+          <w:color w:val="000000" w:themeColor="text1"/>
+        </w:rPr>
+        <w:lastRenderedPageBreak/>
+        <w:t xml:space="preserve">McGurk R., Dooley J., Adapa K., Write J., Marks L., Mazur L. </w:t>
       </w:r>
       <w:r>
         <w:rPr>
@@ -3191,7 +3250,44 @@
           <w:iCs/>
           <w:color w:val="000000" w:themeColor="text1"/>
         </w:rPr>
-        <w:t xml:space="preserve">Using a Deep Learning System to Delineate the Elective Pelvis Nodal Volumes in Patients </w:t>
+        <w:t>Deep Learning-Based Vessel Auto-Segmentation for Standardized Lymph Node Delineation in Prostate Cancer Radiotherapy</w:t>
+      </w:r>
+      <w:r>
+        <w:rPr>
+          <w:rFonts w:ascii="Times New Roman" w:hAnsi="Times New Roman" w:cs="Times New Roman"/>
+          <w:color w:val="000000" w:themeColor="text1"/>
+        </w:rPr>
+        <w:t xml:space="preserve"> Practical Radiation Oncology 09/2026</w:t>
+      </w:r>
+    </w:p>
+    <w:p>
+      <w:pPr>
+        <w:pStyle w:val="ListParagraph"/>
+        <w:numPr>
+          <w:ilvl w:val="0"/>
+          <w:numId w:val="8"/>
+        </w:numPr>
+        <w:spacing w:after="60" w:line="240" w:lineRule="auto"/>
+        <w:rPr>
+          <w:rFonts w:ascii="Times New Roman" w:hAnsi="Times New Roman" w:cs="Times New Roman"/>
+          <w:color w:val="000000" w:themeColor="text1"/>
+        </w:rPr>
+      </w:pPr>
+      <w:r>
+        <w:rPr>
+          <w:rFonts w:ascii="Times New Roman" w:hAnsi="Times New Roman" w:cs="Times New Roman"/>
+          <w:b/>
+          <w:bCs/>
+          <w:color w:val="000000" w:themeColor="text1"/>
+        </w:rPr>
+        <w:t>Anderson B.M</w:t>
+      </w:r>
+      <w:r>
+        <w:rPr>
+          <w:rFonts w:ascii="Times New Roman" w:hAnsi="Times New Roman" w:cs="Times New Roman"/>
+          <w:color w:val="000000" w:themeColor="text1"/>
+        </w:rPr>
+        <w:t xml:space="preserve">, Repka M, Gao Y, Byrd E, McGurk R, Das S, Arcot R, Bhattacharya S, Adapa K, Wright J, Marks L, Mazur L. </w:t>
       </w:r>
       <w:r>
         <w:rPr>
@@ -3200,8 +3296,7 @@
           <w:iCs/>
           <w:color w:val="000000" w:themeColor="text1"/>
         </w:rPr>
-        <w:lastRenderedPageBreak/>
-        <w:t>with Prostate Cancer: A Tool Aimed to Facilitate Peer Review.</w:t>
+        <w:t>Using a Deep Learning System to Delineate the Elective Pelvis Nodal Volumes in Patients with Prostate Cancer: A Tool Aimed to Facilitate Peer Review.</w:t>
       </w:r>
       <w:r>
         <w:rPr>
@@ -3912,7 +4007,16 @@
           <w:i/>
           <w:color w:val="000000" w:themeColor="text1"/>
         </w:rPr>
-        <w:t>Evaluating the Performance of StyleGAN2-ADA on Medical Images.</w:t>
+        <w:t xml:space="preserve">Evaluating the Performance of StyleGAN2-ADA on </w:t>
+      </w:r>
+      <w:r>
+        <w:rPr>
+          <w:rFonts w:ascii="Times New Roman" w:hAnsi="Times New Roman" w:cs="Times New Roman"/>
+          <w:i/>
+          <w:color w:val="000000" w:themeColor="text1"/>
+        </w:rPr>
+        <w:lastRenderedPageBreak/>
+        <w:t>Medical Images.</w:t>
       </w:r>
       <w:r>
         <w:rPr>
@@ -3963,17 +4067,7 @@
           <w:iCs/>
           <w:color w:val="000000" w:themeColor="text1"/>
         </w:rPr>
-        <w:t xml:space="preserve">Study Protocol COVER-ALL: Clinical impact of a volumetric image method for confirming </w:t>
-      </w:r>
-      <w:r>
-        <w:rPr>
-          <w:rFonts w:ascii="Times New Roman" w:hAnsi="Times New Roman" w:cs="Times New Roman"/>
-          <w:i/>
-          <w:iCs/>
-          <w:color w:val="000000" w:themeColor="text1"/>
-        </w:rPr>
-        <w:lastRenderedPageBreak/>
-        <w:t>tumour coverage with ablation on patients with malignant liver lesions.</w:t>
+        <w:t>Study Protocol COVER-ALL: Clinical impact of a volumetric image method for confirming tumour coverage with ablation on patients with malignant liver lesions.</w:t>
       </w:r>
       <w:r>
         <w:rPr>
@@ -4721,7 +4815,15 @@
           <w:rFonts w:ascii="Times New Roman" w:hAnsi="Times New Roman"/>
           <w:color w:val="000000" w:themeColor="text1"/>
         </w:rPr>
-        <w:t xml:space="preserve">, Gay C, Ning J, Fuller CD, Li H, Howell RM, Layman RR, Mawlawi O, Stafford RJ, Aerts H, Court LE. </w:t>
+        <w:t xml:space="preserve">, Gay C, </w:t>
+      </w:r>
+      <w:r>
+        <w:rPr>
+          <w:rFonts w:ascii="Times New Roman" w:hAnsi="Times New Roman"/>
+          <w:color w:val="000000" w:themeColor="text1"/>
+        </w:rPr>
+        <w:lastRenderedPageBreak/>
+        <w:t xml:space="preserve">Ning J, Fuller CD, Li H, Howell RM, Layman RR, Mawlawi O, Stafford RJ, Aerts H, Court LE. </w:t>
       </w:r>
       <w:r>
         <w:rPr>
@@ -4771,15 +4873,7 @@
           <w:rFonts w:ascii="Times New Roman" w:hAnsi="Times New Roman" w:cs="Times New Roman"/>
           <w:color w:val="000000" w:themeColor="text1"/>
         </w:rPr>
-        <w:t xml:space="preserve">, Cazoulat G, Peterson CB, Mohamed ASR, Volpe S, Elhalawani H, Bahig H, </w:t>
-      </w:r>
-      <w:r>
-        <w:rPr>
-          <w:rFonts w:ascii="Times New Roman" w:hAnsi="Times New Roman" w:cs="Times New Roman"/>
-          <w:color w:val="000000" w:themeColor="text1"/>
-        </w:rPr>
-        <w:lastRenderedPageBreak/>
-        <w:t xml:space="preserve">Rigaud B, King JB, Ford AC, Fuller CD, Brock KK </w:t>
+        <w:t xml:space="preserve">, Cazoulat G, Peterson CB, Mohamed ASR, Volpe S, Elhalawani H, Bahig H, Rigaud B, King JB, Ford AC, Fuller CD, Brock KK </w:t>
       </w:r>
       <w:r>
         <w:rPr>
@@ -5554,14 +5648,24 @@
           <w:color w:val="000000" w:themeColor="text1"/>
           <w:shd w:val="clear" w:color="auto" w:fill="FFFFFF"/>
         </w:rPr>
-        <w:t xml:space="preserve">Closing the Variability Gaps on Liver Surgery: Deep Segmentation of Disease and Lobes. </w:t>
-      </w:r>
-      <w:r>
-        <w:rPr>
-          <w:rFonts w:ascii="Times New Roman" w:hAnsi="Times New Roman"/>
+        <w:t xml:space="preserve">Closing the Variability Gaps on Liver Surgery: Deep Segmentation of Disease and </w:t>
+      </w:r>
+      <w:r>
+        <w:rPr>
+          <w:rFonts w:ascii="Times New Roman" w:hAnsi="Times New Roman"/>
+          <w:i/>
           <w:color w:val="000000" w:themeColor="text1"/>
           <w:shd w:val="clear" w:color="auto" w:fill="FFFFFF"/>
         </w:rPr>
+        <w:lastRenderedPageBreak/>
+        <w:t xml:space="preserve">Lobes. </w:t>
+      </w:r>
+      <w:r>
+        <w:rPr>
+          <w:rFonts w:ascii="Times New Roman" w:hAnsi="Times New Roman"/>
+          <w:color w:val="000000" w:themeColor="text1"/>
+          <w:shd w:val="clear" w:color="auto" w:fill="FFFFFF"/>
+        </w:rPr>
         <w:t>AAPM Annual Conference. (Virtual) Vancouver, Canada. 07/2020.</w:t>
       </w:r>
     </w:p>
@@ -5648,17 +5752,7 @@
           <w:color w:val="000000" w:themeColor="text1"/>
           <w:shd w:val="clear" w:color="auto" w:fill="FFFFFF"/>
         </w:rPr>
-        <w:t xml:space="preserve">Improving Colorectal Liver Metastasis Treatments </w:t>
-      </w:r>
-      <w:r>
-        <w:rPr>
-          <w:rFonts w:ascii="Times New Roman" w:hAnsi="Times New Roman"/>
-          <w:i/>
-          <w:color w:val="000000" w:themeColor="text1"/>
-          <w:shd w:val="clear" w:color="auto" w:fill="FFFFFF"/>
-        </w:rPr>
-        <w:lastRenderedPageBreak/>
-        <w:t xml:space="preserve">with Biomechanical Modeling and Deep Learning. </w:t>
+        <w:t xml:space="preserve">Improving Colorectal Liver Metastasis Treatments with Biomechanical Modeling and Deep Learning. </w:t>
       </w:r>
       <w:r>
         <w:rPr>
@@ -6434,7 +6528,21 @@
           <w:rFonts w:ascii="Times New Roman" w:eastAsia="Times New Roman" w:hAnsi="Times New Roman" w:cs="Times New Roman"/>
           <w:color w:val="000000" w:themeColor="text1"/>
         </w:rPr>
-        <w:t>ASTRO Annual Conference 10/2026</w:t>
+        <w:t xml:space="preserve">ASTRO Annual Conference </w:t>
+      </w:r>
+      <w:r>
+        <w:rPr>
+          <w:rFonts w:ascii="Times New Roman" w:eastAsia="Times New Roman" w:hAnsi="Times New Roman" w:cs="Times New Roman"/>
+          <w:color w:val="000000" w:themeColor="text1"/>
+        </w:rPr>
+        <w:t>09</w:t>
+      </w:r>
+      <w:r>
+        <w:rPr>
+          <w:rFonts w:ascii="Times New Roman" w:eastAsia="Times New Roman" w:hAnsi="Times New Roman" w:cs="Times New Roman"/>
+          <w:color w:val="000000" w:themeColor="text1"/>
+        </w:rPr>
+        <w:t>/2026</w:t>
       </w:r>
     </w:p>
     <w:p>
@@ -6455,7 +6563,7 @@
           <w:rFonts w:ascii="Times New Roman" w:eastAsia="Times New Roman" w:hAnsi="Times New Roman" w:cs="Times New Roman"/>
           <w:color w:val="000000" w:themeColor="text1"/>
         </w:rPr>
-        <w:t xml:space="preserve">Gao, Y., Wells, D., Bhattacharya, S., Repka, MC., Lavrova, L., </w:t>
+        <w:t xml:space="preserve">Repka M., Marks L., Byrd E., </w:t>
       </w:r>
       <w:r>
         <w:rPr>
@@ -6464,14 +6572,14 @@
           <w:bCs/>
           <w:color w:val="000000" w:themeColor="text1"/>
         </w:rPr>
-        <w:t>Anderson B.M</w:t>
+        <w:t>Anderson B.M.,</w:t>
       </w:r>
       <w:r>
         <w:rPr>
           <w:rFonts w:ascii="Times New Roman" w:eastAsia="Times New Roman" w:hAnsi="Times New Roman" w:cs="Times New Roman"/>
           <w:color w:val="000000" w:themeColor="text1"/>
         </w:rPr>
-        <w:t xml:space="preserve">, Das, SD, Rajasekar, A., Byrd, E., McGurk, R., Dooley, J., Adapa, K., Wright, JL., Marks, LB., Mazur, LM. </w:t>
+        <w:t xml:space="preserve"> Das S., Gao Y., Adapa K., McGurk R., Mazur L. </w:t>
       </w:r>
       <w:r>
         <w:rPr>
@@ -6480,14 +6588,28 @@
           <w:iCs/>
           <w:color w:val="000000" w:themeColor="text1"/>
         </w:rPr>
-        <w:t>Deep Learning-Based Pelvic Vessel Auto-Segmentation for Standarized Lymph Node Delineation in Prostate Cancer Radiotherapy.</w:t>
+        <w:t>Prospective Assessment of the Impact of AI on Peer Review of Elective Pelvic Nodal Segmentations</w:t>
       </w:r>
       <w:r>
         <w:rPr>
           <w:rFonts w:ascii="Times New Roman" w:eastAsia="Times New Roman" w:hAnsi="Times New Roman" w:cs="Times New Roman"/>
           <w:color w:val="000000" w:themeColor="text1"/>
         </w:rPr>
-        <w:t xml:space="preserve"> ASTRO Annual Conference 10/2026</w:t>
+        <w:t xml:space="preserve"> ASTRO </w:t>
+      </w:r>
+      <w:r>
+        <w:rPr>
+          <w:rFonts w:ascii="Times New Roman" w:eastAsia="Times New Roman" w:hAnsi="Times New Roman" w:cs="Times New Roman"/>
+          <w:color w:val="000000" w:themeColor="text1"/>
+        </w:rPr>
+        <w:t xml:space="preserve">Annual Conference </w:t>
+      </w:r>
+      <w:r>
+        <w:rPr>
+          <w:rFonts w:ascii="Times New Roman" w:eastAsia="Times New Roman" w:hAnsi="Times New Roman" w:cs="Times New Roman"/>
+          <w:color w:val="000000" w:themeColor="text1"/>
+        </w:rPr>
+        <w:t>09/2026</w:t>
       </w:r>
     </w:p>
     <w:p>
@@ -6508,7 +6630,7 @@
           <w:rFonts w:ascii="Times New Roman" w:eastAsia="Times New Roman" w:hAnsi="Times New Roman" w:cs="Times New Roman"/>
           <w:color w:val="000000" w:themeColor="text1"/>
         </w:rPr>
-        <w:t xml:space="preserve">Das S., Dong F., Morse R., </w:t>
+        <w:t xml:space="preserve">Gao, Y., Wells, D., Bhattacharya, S., Repka, MC., Lavrova, L., </w:t>
       </w:r>
       <w:r>
         <w:rPr>
@@ -6517,14 +6639,14 @@
           <w:bCs/>
           <w:color w:val="000000" w:themeColor="text1"/>
         </w:rPr>
-        <w:t>Anderson B.M,</w:t>
+        <w:t>Anderson B.M</w:t>
       </w:r>
       <w:r>
         <w:rPr>
           <w:rFonts w:ascii="Times New Roman" w:eastAsia="Times New Roman" w:hAnsi="Times New Roman" w:cs="Times New Roman"/>
           <w:color w:val="000000" w:themeColor="text1"/>
         </w:rPr>
-        <w:t xml:space="preserve"> Chera B., Shen C., Repka M., Yarbrough W., Hackman T., Blumberg J., Lumley C., Weiss J., Patel S., Sheth S., Chen X. </w:t>
+        <w:t xml:space="preserve">, Das, SD, Rajasekar, A., Byrd, E., McGurk, R., Dooley, J., Adapa, K., Wright, JL., Marks, LB., Mazur, LM. </w:t>
       </w:r>
       <w:r>
         <w:rPr>
@@ -6533,59 +6655,7 @@
           <w:iCs/>
           <w:color w:val="000000" w:themeColor="text1"/>
         </w:rPr>
-        <w:t>Predicting Dysphagia and Identifying Anatomical Regions Responsible for Dysphagia Following Intensity-Modulated Radiation Therapy (IMRT) for Oropharyngeal Carcinoma.</w:t>
-      </w:r>
-      <w:r>
-        <w:rPr>
-          <w:rFonts w:ascii="Times New Roman" w:eastAsia="Times New Roman" w:hAnsi="Times New Roman" w:cs="Times New Roman"/>
-          <w:color w:val="000000" w:themeColor="text1"/>
-        </w:rPr>
-        <w:t xml:space="preserve"> ASTRO Annual Conference 10/2026</w:t>
-      </w:r>
-    </w:p>
-    <w:p>
-      <w:pPr>
-        <w:pStyle w:val="ListParagraph"/>
-        <w:numPr>
-          <w:ilvl w:val="0"/>
-          <w:numId w:val="5"/>
-        </w:numPr>
-        <w:spacing w:after="120"/>
-        <w:rPr>
-          <w:rFonts w:ascii="Times New Roman" w:eastAsia="Times New Roman" w:hAnsi="Times New Roman" w:cs="Times New Roman"/>
-          <w:color w:val="000000" w:themeColor="text1"/>
-        </w:rPr>
-      </w:pPr>
-      <w:r>
-        <w:rPr>
-          <w:rFonts w:ascii="Times New Roman" w:eastAsia="Times New Roman" w:hAnsi="Times New Roman" w:cs="Times New Roman"/>
-          <w:color w:val="000000" w:themeColor="text1"/>
-        </w:rPr>
-        <w:t xml:space="preserve">Sousa C., Doss V., Hales E., Hagan E., Gebre T., Obaideen A., Negassa M., Liu D., </w:t>
-      </w:r>
-      <w:r>
-        <w:rPr>
-          <w:rFonts w:ascii="Times New Roman" w:eastAsia="Times New Roman" w:hAnsi="Times New Roman" w:cs="Times New Roman"/>
-          <w:b/>
-          <w:bCs/>
-          <w:color w:val="000000" w:themeColor="text1"/>
-        </w:rPr>
-        <w:t>Anderson B.M</w:t>
-      </w:r>
-      <w:r>
-        <w:rPr>
-          <w:rFonts w:ascii="Times New Roman" w:eastAsia="Times New Roman" w:hAnsi="Times New Roman" w:cs="Times New Roman"/>
-          <w:color w:val="000000" w:themeColor="text1"/>
-        </w:rPr>
-        <w:t xml:space="preserve">, Kooner, </w:t>
-      </w:r>
-      <w:r>
-        <w:rPr>
-          <w:rFonts w:ascii="Times New Roman" w:eastAsia="Times New Roman" w:hAnsi="Times New Roman" w:cs="Times New Roman"/>
-          <w:color w:val="000000" w:themeColor="text1"/>
-        </w:rPr>
-        <w:lastRenderedPageBreak/>
-        <w:t xml:space="preserve">Hu C., Li H., Viswanathan A., Jia X., Hales R., Voong K. R, McNutt T., Ger R. </w:t>
+        <w:t xml:space="preserve">Deep Learning-Based Pelvic </w:t>
       </w:r>
       <w:r>
         <w:rPr>
@@ -6594,6 +6664,141 @@
           <w:iCs/>
           <w:color w:val="000000" w:themeColor="text1"/>
         </w:rPr>
+        <w:lastRenderedPageBreak/>
+        <w:t>Vessel Auto-Segmentation for Standarized Lymph Node Delineation in Prostate Cancer Radiotherapy.</w:t>
+      </w:r>
+      <w:r>
+        <w:rPr>
+          <w:rFonts w:ascii="Times New Roman" w:eastAsia="Times New Roman" w:hAnsi="Times New Roman" w:cs="Times New Roman"/>
+          <w:color w:val="000000" w:themeColor="text1"/>
+        </w:rPr>
+        <w:t xml:space="preserve"> ASTRO Annual Conference </w:t>
+      </w:r>
+      <w:r>
+        <w:rPr>
+          <w:rFonts w:ascii="Times New Roman" w:eastAsia="Times New Roman" w:hAnsi="Times New Roman" w:cs="Times New Roman"/>
+          <w:color w:val="000000" w:themeColor="text1"/>
+        </w:rPr>
+        <w:t>09</w:t>
+      </w:r>
+      <w:r>
+        <w:rPr>
+          <w:rFonts w:ascii="Times New Roman" w:eastAsia="Times New Roman" w:hAnsi="Times New Roman" w:cs="Times New Roman"/>
+          <w:color w:val="000000" w:themeColor="text1"/>
+        </w:rPr>
+        <w:t>/2026</w:t>
+      </w:r>
+    </w:p>
+    <w:p>
+      <w:pPr>
+        <w:pStyle w:val="ListParagraph"/>
+        <w:numPr>
+          <w:ilvl w:val="0"/>
+          <w:numId w:val="5"/>
+        </w:numPr>
+        <w:spacing w:after="120"/>
+        <w:rPr>
+          <w:rFonts w:ascii="Times New Roman" w:eastAsia="Times New Roman" w:hAnsi="Times New Roman" w:cs="Times New Roman"/>
+          <w:color w:val="000000" w:themeColor="text1"/>
+        </w:rPr>
+      </w:pPr>
+      <w:r>
+        <w:rPr>
+          <w:rFonts w:ascii="Times New Roman" w:eastAsia="Times New Roman" w:hAnsi="Times New Roman" w:cs="Times New Roman"/>
+          <w:color w:val="000000" w:themeColor="text1"/>
+        </w:rPr>
+        <w:t xml:space="preserve">Das S., Dong F., Morse R., </w:t>
+      </w:r>
+      <w:r>
+        <w:rPr>
+          <w:rFonts w:ascii="Times New Roman" w:eastAsia="Times New Roman" w:hAnsi="Times New Roman" w:cs="Times New Roman"/>
+          <w:b/>
+          <w:bCs/>
+          <w:color w:val="000000" w:themeColor="text1"/>
+        </w:rPr>
+        <w:t>Anderson B.M,</w:t>
+      </w:r>
+      <w:r>
+        <w:rPr>
+          <w:rFonts w:ascii="Times New Roman" w:eastAsia="Times New Roman" w:hAnsi="Times New Roman" w:cs="Times New Roman"/>
+          <w:color w:val="000000" w:themeColor="text1"/>
+        </w:rPr>
+        <w:t xml:space="preserve"> Chera B., Shen C., Repka M., Yarbrough W., Hackman T., Blumberg J., Lumley C., Weiss J., Patel S., Sheth S., Chen X. </w:t>
+      </w:r>
+      <w:r>
+        <w:rPr>
+          <w:rFonts w:ascii="Times New Roman" w:eastAsia="Times New Roman" w:hAnsi="Times New Roman" w:cs="Times New Roman"/>
+          <w:i/>
+          <w:iCs/>
+          <w:color w:val="000000" w:themeColor="text1"/>
+        </w:rPr>
+        <w:t>Predicting Dysphagia and Identifying Anatomical Regions Responsible for Dysphagia Following Intensity-Modulated Radiation Therapy (IMRT) for Oropharyngeal Carcinoma.</w:t>
+      </w:r>
+      <w:r>
+        <w:rPr>
+          <w:rFonts w:ascii="Times New Roman" w:eastAsia="Times New Roman" w:hAnsi="Times New Roman" w:cs="Times New Roman"/>
+          <w:color w:val="000000" w:themeColor="text1"/>
+        </w:rPr>
+        <w:t xml:space="preserve"> ASTRO Annual Conference </w:t>
+      </w:r>
+      <w:r>
+        <w:rPr>
+          <w:rFonts w:ascii="Times New Roman" w:eastAsia="Times New Roman" w:hAnsi="Times New Roman" w:cs="Times New Roman"/>
+          <w:color w:val="000000" w:themeColor="text1"/>
+        </w:rPr>
+        <w:t>09</w:t>
+      </w:r>
+      <w:r>
+        <w:rPr>
+          <w:rFonts w:ascii="Times New Roman" w:eastAsia="Times New Roman" w:hAnsi="Times New Roman" w:cs="Times New Roman"/>
+          <w:color w:val="000000" w:themeColor="text1"/>
+        </w:rPr>
+        <w:t>/2026</w:t>
+      </w:r>
+    </w:p>
+    <w:p>
+      <w:pPr>
+        <w:pStyle w:val="ListParagraph"/>
+        <w:numPr>
+          <w:ilvl w:val="0"/>
+          <w:numId w:val="5"/>
+        </w:numPr>
+        <w:spacing w:after="120"/>
+        <w:rPr>
+          <w:rFonts w:ascii="Times New Roman" w:eastAsia="Times New Roman" w:hAnsi="Times New Roman" w:cs="Times New Roman"/>
+          <w:color w:val="000000" w:themeColor="text1"/>
+        </w:rPr>
+      </w:pPr>
+      <w:r>
+        <w:rPr>
+          <w:rFonts w:ascii="Times New Roman" w:eastAsia="Times New Roman" w:hAnsi="Times New Roman" w:cs="Times New Roman"/>
+          <w:color w:val="000000" w:themeColor="text1"/>
+        </w:rPr>
+        <w:t xml:space="preserve">Sousa C., Doss V., Hales E., Hagan E., Gebre T., Obaideen A., Negassa M., Liu D., </w:t>
+      </w:r>
+      <w:r>
+        <w:rPr>
+          <w:rFonts w:ascii="Times New Roman" w:eastAsia="Times New Roman" w:hAnsi="Times New Roman" w:cs="Times New Roman"/>
+          <w:b/>
+          <w:bCs/>
+          <w:color w:val="000000" w:themeColor="text1"/>
+        </w:rPr>
+        <w:t>Anderson B.M</w:t>
+      </w:r>
+      <w:r>
+        <w:rPr>
+          <w:rFonts w:ascii="Times New Roman" w:eastAsia="Times New Roman" w:hAnsi="Times New Roman" w:cs="Times New Roman"/>
+          <w:color w:val="000000" w:themeColor="text1"/>
+        </w:rPr>
+        <w:t xml:space="preserve">, Kooner, Hu C., Li H., Viswanathan A., Jia X., Hales R., Voong K. R, McNutt T., Ger R. </w:t>
+      </w:r>
+      <w:r>
+        <w:rPr>
+          <w:rFonts w:ascii="Times New Roman" w:eastAsia="Times New Roman" w:hAnsi="Times New Roman" w:cs="Times New Roman"/>
+          <w:i/>
+          <w:iCs/>
+          <w:color w:val="000000" w:themeColor="text1"/>
+        </w:rPr>
         <w:t>Cumulative EQD2 Esophageal Dose and Severe Toxicity After Thoracic Reirradiation.</w:t>
       </w:r>
       <w:r>
@@ -6601,7 +6806,21 @@
           <w:rFonts w:ascii="Times New Roman" w:eastAsia="Times New Roman" w:hAnsi="Times New Roman" w:cs="Times New Roman"/>
           <w:color w:val="000000" w:themeColor="text1"/>
         </w:rPr>
-        <w:t xml:space="preserve"> ASTRO Annual Conference 10/2026</w:t>
+        <w:t xml:space="preserve"> ASTRO Annual Conference </w:t>
+      </w:r>
+      <w:r>
+        <w:rPr>
+          <w:rFonts w:ascii="Times New Roman" w:eastAsia="Times New Roman" w:hAnsi="Times New Roman" w:cs="Times New Roman"/>
+          <w:color w:val="000000" w:themeColor="text1"/>
+        </w:rPr>
+        <w:t>09</w:t>
+      </w:r>
+      <w:r>
+        <w:rPr>
+          <w:rFonts w:ascii="Times New Roman" w:eastAsia="Times New Roman" w:hAnsi="Times New Roman" w:cs="Times New Roman"/>
+          <w:color w:val="000000" w:themeColor="text1"/>
+        </w:rPr>
+        <w:t>/2026</w:t>
       </w:r>
     </w:p>
     <w:p>
@@ -7330,7 +7549,15 @@
           <w:rFonts w:ascii="Times New Roman" w:hAnsi="Times New Roman"/>
           <w:color w:val="000000" w:themeColor="text1"/>
         </w:rPr>
-        <w:t xml:space="preserve">Lee J., Gay S., Yang J., McCarroll R., Machin D., Li Y., Rhee D., Edward S., He Y., David S., Nitsch P, Balter P., Court L </w:t>
+        <w:t xml:space="preserve">Lee J., Gay S., Yang J., McCarroll R., Machin D., Li Y., Rhee D., Edward S., He Y., David S., Nitsch P, </w:t>
+      </w:r>
+      <w:r>
+        <w:rPr>
+          <w:rFonts w:ascii="Times New Roman" w:hAnsi="Times New Roman"/>
+          <w:color w:val="000000" w:themeColor="text1"/>
+        </w:rPr>
+        <w:lastRenderedPageBreak/>
+        <w:t xml:space="preserve">Balter P., Court L </w:t>
       </w:r>
       <w:r>
         <w:rPr>
@@ -7447,15 +7674,7 @@
           <w:rFonts w:ascii="Times New Roman" w:hAnsi="Times New Roman" w:cs="Times New Roman"/>
           <w:color w:val="000000" w:themeColor="text1"/>
         </w:rPr>
-        <w:t xml:space="preserve">AAPM </w:t>
-      </w:r>
-      <w:r>
-        <w:rPr>
-          <w:rFonts w:ascii="Times New Roman" w:hAnsi="Times New Roman" w:cs="Times New Roman"/>
-          <w:color w:val="000000" w:themeColor="text1"/>
-        </w:rPr>
-        <w:lastRenderedPageBreak/>
-        <w:t>Annual Conference. Nashville, TN. 07/2018</w:t>
+        <w:t>AAPM Annual Conference. Nashville, TN. 07/2018</w:t>
       </w:r>
     </w:p>
     <w:p>
@@ -7723,7 +7942,7 @@
 </file>
 
 <file path=word/endnotes.xml><?xml version="1.0" encoding="utf-8"?>
-<w:endnotes xmlns:wpc="http://schemas.microsoft.com/office/word/2010/wordprocessingCanvas" xmlns:cx="http://schemas.microsoft.com/office/drawing/2014/chartex" xmlns:cx1="http://schemas.microsoft.com/office/drawing/2015/9/8/chartex" xmlns:cx2="http://schemas.microsoft.com/office/drawing/2015/10/21/chartex" xmlns:cx3="http://schemas.microsoft.com/office/drawing/2016/5/9/chartex" xmlns:cx4="http://schemas.microsoft.com/office/drawing/2016/5/10/chartex" xmlns:cx5="http://schemas.microsoft.com/office/drawing/2016/5/11/chartex" xmlns:cx6="http://schemas.microsoft.com/office/drawing/2016/5/12/chartex" xmlns:cx7="http://schemas.microsoft.com/office/drawing/2016/5/13/chartex" xmlns:cx8="http://schemas.microsoft.com/office/drawing/2016/5/14/chartex" xmlns:mc="http://schemas.openxmlformats.org/markup-compatibility/2006" xmlns:aink="http://schemas.microsoft.com/office/drawing/2016/ink" xmlns:am3d="http://schemas.microsoft.com/office/drawing/2017/model3d" xmlns:o="urn:schemas-microsoft-com:office:office" xmlns:oel="http://schemas.microsoft.com/office/2019/extlst" xmlns:r="http://schemas.openxmlformats.org/officeDocument/2006/relationships" xmlns:m="http://schemas.openxmlformats.org/officeDocument/2006/math" xmlns:v="urn:schemas-microsoft-com:vml" xmlns:wp14="http://schemas.microsoft.com/office/word/2010/wordprocessingDrawing" xmlns:wp="http://schemas.openxmlformats.org/drawingml/2006/wordprocessingDrawing" xmlns:w10="urn:schemas-microsoft-com:office:word" xmlns:w="http://schemas.openxmlformats.org/wordprocessingml/2006/main" xmlns:w14="http://schemas.microsoft.com/office/word/2010/wordml" xmlns:w15="http://schemas.microsoft.com/office/word/2012/wordml" xmlns:w16cei="http://schemas.microsoft.com/office/word/2026/wordml/cei" xmlns:w16cex="http://schemas.microsoft.com/office/word/2018/wordml/cex" xmlns:w16cid="http://schemas.microsoft.com/office/word/2016/wordml/cid" xmlns:w16="http://schemas.microsoft.com/office/word/2018/wordml" xmlns:w16du="http://schemas.microsoft.com/office/word/2023/wordml/word16du" xmlns:w16sdtdh="http://schemas.microsoft.com/office/word/2020/wordml/sdtdatahash" xmlns:w16sdtfl="http://schemas.microsoft.com/office/word/2024/wordml/sdtformatlock" xmlns:w16se="http://schemas.microsoft.com/office/word/2015/wordml/symex" xmlns:wpg="http://schemas.microsoft.com/office/word/2010/wordprocessingGroup" xmlns:wpi="http://schemas.microsoft.com/office/word/2010/wordprocessingInk" xmlns:wne="http://schemas.microsoft.com/office/word/2006/wordml" xmlns:wps="http://schemas.microsoft.com/office/word/2010/wordprocessingShape" mc:Ignorable="w14 w15 w16se w16cid w16 w16cex w16sdtdh w16sdtfl w16du wp14">
+<w:endnotes xmlns:wpc="http://schemas.microsoft.com/office/word/2010/wordprocessingCanvas" xmlns:cx="http://schemas.microsoft.com/office/drawing/2014/chartex" xmlns:cx1="http://schemas.microsoft.com/office/drawing/2015/9/8/chartex" xmlns:cx2="http://schemas.microsoft.com/office/drawing/2015/10/21/chartex" xmlns:cx3="http://schemas.microsoft.com/office/drawing/2016/5/9/chartex" xmlns:cx4="http://schemas.microsoft.com/office/drawing/2016/5/10/chartex" xmlns:cx5="http://schemas.microsoft.com/office/drawing/2016/5/11/chartex" xmlns:cx6="http://schemas.microsoft.com/office/drawing/2016/5/12/chartex" xmlns:cx7="http://schemas.microsoft.com/office/drawing/2016/5/13/chartex" xmlns:cx8="http://schemas.microsoft.com/office/drawing/2016/5/14/chartex" xmlns:mc="http://schemas.openxmlformats.org/markup-compatibility/2006" xmlns:aink="http://schemas.microsoft.com/office/drawing/2016/ink" xmlns:am3d="http://schemas.microsoft.com/office/drawing/2017/model3d" xmlns:o="urn:schemas-microsoft-com:office:office" xmlns:oel="http://schemas.microsoft.com/office/2019/extlst" xmlns:r="http://schemas.openxmlformats.org/officeDocument/2006/relationships" xmlns:m="http://schemas.openxmlformats.org/officeDocument/2006/math" xmlns:v="urn:schemas-microsoft-com:vml" xmlns:wp14="http://schemas.microsoft.com/office/word/2010/wordprocessingDrawing" xmlns:wp="http://schemas.openxmlformats.org/drawingml/2006/wordprocessingDrawing" xmlns:w10="urn:schemas-microsoft-com:office:word" xmlns:w="http://schemas.openxmlformats.org/wordprocessingml/2006/main" xmlns:w14="http://schemas.microsoft.com/office/word/2010/wordml" xmlns:w15="http://schemas.microsoft.com/office/word/2012/wordml" xmlns:w16cex="http://schemas.microsoft.com/office/word/2018/wordml/cex" xmlns:w16cid="http://schemas.microsoft.com/office/word/2016/wordml/cid" xmlns:w16="http://schemas.microsoft.com/office/word/2018/wordml" xmlns:w16du="http://schemas.microsoft.com/office/word/2023/wordml/word16du" xmlns:w16sdtdh="http://schemas.microsoft.com/office/word/2020/wordml/sdtdatahash" xmlns:w16sdtfl="http://schemas.microsoft.com/office/word/2024/wordml/sdtformatlock" xmlns:w16se="http://schemas.microsoft.com/office/word/2015/wordml/symex" xmlns:wpg="http://schemas.microsoft.com/office/word/2010/wordprocessingGroup" xmlns:wpi="http://schemas.microsoft.com/office/word/2010/wordprocessingInk" xmlns:wne="http://schemas.microsoft.com/office/word/2006/wordml" xmlns:wps="http://schemas.microsoft.com/office/word/2010/wordprocessingShape" mc:Ignorable="w14 w15 w16se w16cid w16 w16cex w16sdtdh w16sdtfl w16du wp14">
   <w:endnote w:type="separator" w:id="-1">
     <w:p>
       <w:pPr>
@@ -7748,7 +7967,7 @@
 </file>
 
 <file path=word/footnotes.xml><?xml version="1.0" encoding="utf-8"?>
-<w:footnotes xmlns:wpc="http://schemas.microsoft.com/office/word/2010/wordprocessingCanvas" xmlns:cx="http://schemas.microsoft.com/office/drawing/2014/chartex" xmlns:cx1="http://schemas.microsoft.com/office/drawing/2015/9/8/chartex" xmlns:cx2="http://schemas.microsoft.com/office/drawing/2015/10/21/chartex" xmlns:cx3="http://schemas.microsoft.com/office/drawing/2016/5/9/chartex" xmlns:cx4="http://schemas.microsoft.com/office/drawing/2016/5/10/chartex" xmlns:cx5="http://schemas.microsoft.com/office/drawing/2016/5/11/chartex" xmlns:cx6="http://schemas.microsoft.com/office/drawing/2016/5/12/chartex" xmlns:cx7="http://schemas.microsoft.com/office/drawing/2016/5/13/chartex" xmlns:cx8="http://schemas.microsoft.com/office/drawing/2016/5/14/chartex" xmlns:mc="http://schemas.openxmlformats.org/markup-compatibility/2006" xmlns:aink="http://schemas.microsoft.com/office/drawing/2016/ink" xmlns:am3d="http://schemas.microsoft.com/office/drawing/2017/model3d" xmlns:o="urn:schemas-microsoft-com:office:office" xmlns:oel="http://schemas.microsoft.com/office/2019/extlst" xmlns:r="http://schemas.openxmlformats.org/officeDocument/2006/relationships" xmlns:m="http://schemas.openxmlformats.org/officeDocument/2006/math" xmlns:v="urn:schemas-microsoft-com:vml" xmlns:wp14="http://schemas.microsoft.com/office/word/2010/wordprocessingDrawing" xmlns:wp="http://schemas.openxmlformats.org/drawingml/2006/wordprocessingDrawing" xmlns:w10="urn:schemas-microsoft-com:office:word" xmlns:w="http://schemas.openxmlformats.org/wordprocessingml/2006/main" xmlns:w14="http://schemas.microsoft.com/office/word/2010/wordml" xmlns:w15="http://schemas.microsoft.com/office/word/2012/wordml" xmlns:w16cei="http://schemas.microsoft.com/office/word/2026/wordml/cei" xmlns:w16cex="http://schemas.microsoft.com/office/word/2018/wordml/cex" xmlns:w16cid="http://schemas.microsoft.com/office/word/2016/wordml/cid" xmlns:w16="http://schemas.microsoft.com/office/word/2018/wordml" xmlns:w16du="http://schemas.microsoft.com/office/word/2023/wordml/word16du" xmlns:w16sdtdh="http://schemas.microsoft.com/office/word/2020/wordml/sdtdatahash" xmlns:w16sdtfl="http://schemas.microsoft.com/office/word/2024/wordml/sdtformatlock" xmlns:w16se="http://schemas.microsoft.com/office/word/2015/wordml/symex" xmlns:wpg="http://schemas.microsoft.com/office/word/2010/wordprocessingGroup" xmlns:wpi="http://schemas.microsoft.com/office/word/2010/wordprocessingInk" xmlns:wne="http://schemas.microsoft.com/office/word/2006/wordml" xmlns:wps="http://schemas.microsoft.com/office/word/2010/wordprocessingShape" mc:Ignorable="w14 w15 w16se w16cid w16 w16cex w16sdtdh w16sdtfl w16du wp14">
+<w:footnotes xmlns:wpc="http://schemas.microsoft.com/office/word/2010/wordprocessingCanvas" xmlns:cx="http://schemas.microsoft.com/office/drawing/2014/chartex" xmlns:cx1="http://schemas.microsoft.com/office/drawing/2015/9/8/chartex" xmlns:cx2="http://schemas.microsoft.com/office/drawing/2015/10/21/chartex" xmlns:cx3="http://schemas.microsoft.com/office/drawing/2016/5/9/chartex" xmlns:cx4="http://schemas.microsoft.com/office/drawing/2016/5/10/chartex" xmlns:cx5="http://schemas.microsoft.com/office/drawing/2016/5/11/chartex" xmlns:cx6="http://schemas.microsoft.com/office/drawing/2016/5/12/chartex" xmlns:cx7="http://schemas.microsoft.com/office/drawing/2016/5/13/chartex" xmlns:cx8="http://schemas.microsoft.com/office/drawing/2016/5/14/chartex" xmlns:mc="http://schemas.openxmlformats.org/markup-compatibility/2006" xmlns:aink="http://schemas.microsoft.com/office/drawing/2016/ink" xmlns:am3d="http://schemas.microsoft.com/office/drawing/2017/model3d" xmlns:o="urn:schemas-microsoft-com:office:office" xmlns:oel="http://schemas.microsoft.com/office/2019/extlst" xmlns:r="http://schemas.openxmlformats.org/officeDocument/2006/relationships" xmlns:m="http://schemas.openxmlformats.org/officeDocument/2006/math" xmlns:v="urn:schemas-microsoft-com:vml" xmlns:wp14="http://schemas.microsoft.com/office/word/2010/wordprocessingDrawing" xmlns:wp="http://schemas.openxmlformats.org/drawingml/2006/wordprocessingDrawing" xmlns:w10="urn:schemas-microsoft-com:office:word" xmlns:w="http://schemas.openxmlformats.org/wordprocessingml/2006/main" xmlns:w14="http://schemas.microsoft.com/office/word/2010/wordml" xmlns:w15="http://schemas.microsoft.com/office/word/2012/wordml" xmlns:w16cex="http://schemas.microsoft.com/office/word/2018/wordml/cex" xmlns:w16cid="http://schemas.microsoft.com/office/word/2016/wordml/cid" xmlns:w16="http://schemas.microsoft.com/office/word/2018/wordml" xmlns:w16du="http://schemas.microsoft.com/office/word/2023/wordml/word16du" xmlns:w16sdtdh="http://schemas.microsoft.com/office/word/2020/wordml/sdtdatahash" xmlns:w16sdtfl="http://schemas.microsoft.com/office/word/2024/wordml/sdtformatlock" xmlns:w16se="http://schemas.microsoft.com/office/word/2015/wordml/symex" xmlns:wpg="http://schemas.microsoft.com/office/word/2010/wordprocessingGroup" xmlns:wpi="http://schemas.microsoft.com/office/word/2010/wordprocessingInk" xmlns:wne="http://schemas.microsoft.com/office/word/2006/wordml" xmlns:wps="http://schemas.microsoft.com/office/word/2010/wordprocessingShape" mc:Ignorable="w14 w15 w16se w16cid w16 w16cex w16sdtdh w16sdtfl w16du wp14">
   <w:footnote w:type="separator" w:id="-1">
     <w:p>
       <w:pPr>
@@ -7773,7 +7992,7 @@
 </file>
 
 <file path=word/header1.xml><?xml version="1.0" encoding="utf-8"?>
-<w:hdr xmlns:wpc="http://schemas.microsoft.com/office/word/2010/wordprocessingCanvas" xmlns:cx="http://schemas.microsoft.com/office/drawing/2014/chartex" xmlns:cx1="http://schemas.microsoft.com/office/drawing/2015/9/8/chartex" xmlns:cx2="http://schemas.microsoft.com/office/drawing/2015/10/21/chartex" xmlns:cx3="http://schemas.microsoft.com/office/drawing/2016/5/9/chartex" xmlns:cx4="http://schemas.microsoft.com/office/drawing/2016/5/10/chartex" xmlns:cx5="http://schemas.microsoft.com/office/drawing/2016/5/11/chartex" xmlns:cx6="http://schemas.microsoft.com/office/drawing/2016/5/12/chartex" xmlns:cx7="http://schemas.microsoft.com/office/drawing/2016/5/13/chartex" xmlns:cx8="http://schemas.microsoft.com/office/drawing/2016/5/14/chartex" xmlns:mc="http://schemas.openxmlformats.org/markup-compatibility/2006" xmlns:aink="http://schemas.microsoft.com/office/drawing/2016/ink" xmlns:am3d="http://schemas.microsoft.com/office/drawing/2017/model3d" xmlns:o="urn:schemas-microsoft-com:office:office" xmlns:oel="http://schemas.microsoft.com/office/2019/extlst" xmlns:r="http://schemas.openxmlformats.org/officeDocument/2006/relationships" xmlns:m="http://schemas.openxmlformats.org/officeDocument/2006/math" xmlns:v="urn:schemas-microsoft-com:vml" xmlns:wp14="http://schemas.microsoft.com/office/word/2010/wordprocessingDrawing" xmlns:wp="http://schemas.openxmlformats.org/drawingml/2006/wordprocessingDrawing" xmlns:w10="urn:schemas-microsoft-com:office:word" xmlns:w="http://schemas.openxmlformats.org/wordprocessingml/2006/main" xmlns:w14="http://schemas.microsoft.com/office/word/2010/wordml" xmlns:w15="http://schemas.microsoft.com/office/word/2012/wordml" xmlns:w16cei="http://schemas.microsoft.com/office/word/2026/wordml/cei" xmlns:w16cex="http://schemas.microsoft.com/office/word/2018/wordml/cex" xmlns:w16cid="http://schemas.microsoft.com/office/word/2016/wordml/cid" xmlns:w16="http://schemas.microsoft.com/office/word/2018/wordml" xmlns:w16du="http://schemas.microsoft.com/office/word/2023/wordml/word16du" xmlns:w16sdtdh="http://schemas.microsoft.com/office/word/2020/wordml/sdtdatahash" xmlns:w16sdtfl="http://schemas.microsoft.com/office/word/2024/wordml/sdtformatlock" xmlns:w16se="http://schemas.microsoft.com/office/word/2015/wordml/symex" xmlns:wpg="http://schemas.microsoft.com/office/word/2010/wordprocessingGroup" xmlns:wpi="http://schemas.microsoft.com/office/word/2010/wordprocessingInk" xmlns:wne="http://schemas.microsoft.com/office/word/2006/wordml" xmlns:wps="http://schemas.microsoft.com/office/word/2010/wordprocessingShape" mc:Ignorable="w14 w15 w16se w16cid w16 w16cex w16sdtdh w16sdtfl w16du wp14">
+<w:hdr xmlns:wpc="http://schemas.microsoft.com/office/word/2010/wordprocessingCanvas" xmlns:cx="http://schemas.microsoft.com/office/drawing/2014/chartex" xmlns:cx1="http://schemas.microsoft.com/office/drawing/2015/9/8/chartex" xmlns:cx2="http://schemas.microsoft.com/office/drawing/2015/10/21/chartex" xmlns:cx3="http://schemas.microsoft.com/office/drawing/2016/5/9/chartex" xmlns:cx4="http://schemas.microsoft.com/office/drawing/2016/5/10/chartex" xmlns:cx5="http://schemas.microsoft.com/office/drawing/2016/5/11/chartex" xmlns:cx6="http://schemas.microsoft.com/office/drawing/2016/5/12/chartex" xmlns:cx7="http://schemas.microsoft.com/office/drawing/2016/5/13/chartex" xmlns:cx8="http://schemas.microsoft.com/office/drawing/2016/5/14/chartex" xmlns:mc="http://schemas.openxmlformats.org/markup-compatibility/2006" xmlns:aink="http://schemas.microsoft.com/office/drawing/2016/ink" xmlns:am3d="http://schemas.microsoft.com/office/drawing/2017/model3d" xmlns:o="urn:schemas-microsoft-com:office:office" xmlns:oel="http://schemas.microsoft.com/office/2019/extlst" xmlns:r="http://schemas.openxmlformats.org/officeDocument/2006/relationships" xmlns:m="http://schemas.openxmlformats.org/officeDocument/2006/math" xmlns:v="urn:schemas-microsoft-com:vml" xmlns:wp14="http://schemas.microsoft.com/office/word/2010/wordprocessingDrawing" xmlns:wp="http://schemas.openxmlformats.org/drawingml/2006/wordprocessingDrawing" xmlns:w10="urn:schemas-microsoft-com:office:word" xmlns:w="http://schemas.openxmlformats.org/wordprocessingml/2006/main" xmlns:w14="http://schemas.microsoft.com/office/word/2010/wordml" xmlns:w15="http://schemas.microsoft.com/office/word/2012/wordml" xmlns:w16cex="http://schemas.microsoft.com/office/word/2018/wordml/cex" xmlns:w16cid="http://schemas.microsoft.com/office/word/2016/wordml/cid" xmlns:w16="http://schemas.microsoft.com/office/word/2018/wordml" xmlns:w16du="http://schemas.microsoft.com/office/word/2023/wordml/word16du" xmlns:w16sdtdh="http://schemas.microsoft.com/office/word/2020/wordml/sdtdatahash" xmlns:w16sdtfl="http://schemas.microsoft.com/office/word/2024/wordml/sdtformatlock" xmlns:w16se="http://schemas.microsoft.com/office/word/2015/wordml/symex" xmlns:wpg="http://schemas.microsoft.com/office/word/2010/wordprocessingGroup" xmlns:wpi="http://schemas.microsoft.com/office/word/2010/wordprocessingInk" xmlns:wne="http://schemas.microsoft.com/office/word/2006/wordml" xmlns:wps="http://schemas.microsoft.com/office/word/2010/wordprocessingShape" mc:Ignorable="w14 w15 w16se w16cid w16 w16cex w16sdtdh w16sdtfl w16du wp14">
   <w:p>
     <w:pPr>
       <w:spacing w:after="0" w:line="0" w:lineRule="atLeast"/>
@@ -7787,7 +8006,7 @@
 </file>
 
 <file path=word/numbering.xml><?xml version="1.0" encoding="utf-8"?>
-<w:numbering xmlns:wpc="http://schemas.microsoft.com/office/word/2010/wordprocessingCanvas" xmlns:cx="http://schemas.microsoft.com/office/drawing/2014/chartex" xmlns:cx1="http://schemas.microsoft.com/office/drawing/2015/9/8/chartex" xmlns:cx2="http://schemas.microsoft.com/office/drawing/2015/10/21/chartex" xmlns:cx3="http://schemas.microsoft.com/office/drawing/2016/5/9/chartex" xmlns:cx4="http://schemas.microsoft.com/office/drawing/2016/5/10/chartex" xmlns:cx5="http://schemas.microsoft.com/office/drawing/2016/5/11/chartex" xmlns:cx6="http://schemas.microsoft.com/office/drawing/2016/5/12/chartex" xmlns:cx7="http://schemas.microsoft.com/office/drawing/2016/5/13/chartex" xmlns:cx8="http://schemas.microsoft.com/office/drawing/2016/5/14/chartex" xmlns:mc="http://schemas.openxmlformats.org/markup-compatibility/2006" xmlns:aink="http://schemas.microsoft.com/office/drawing/2016/ink" xmlns:am3d="http://schemas.microsoft.com/office/drawing/2017/model3d" xmlns:o="urn:schemas-microsoft-com:office:office" xmlns:oel="http://schemas.microsoft.com/office/2019/extlst" xmlns:r="http://schemas.openxmlformats.org/officeDocument/2006/relationships" xmlns:m="http://schemas.openxmlformats.org/officeDocument/2006/math" xmlns:v="urn:schemas-microsoft-com:vml" xmlns:wp14="http://schemas.microsoft.com/office/word/2010/wordprocessingDrawing" xmlns:wp="http://schemas.openxmlformats.org/drawingml/2006/wordprocessingDrawing" xmlns:w10="urn:schemas-microsoft-com:office:word" xmlns:w="http://schemas.openxmlformats.org/wordprocessingml/2006/main" xmlns:w14="http://schemas.microsoft.com/office/word/2010/wordml" xmlns:w15="http://schemas.microsoft.com/office/word/2012/wordml" xmlns:w16cei="http://schemas.microsoft.com/office/word/2026/wordml/cei" xmlns:w16cex="http://schemas.microsoft.com/office/word/2018/wordml/cex" xmlns:w16cid="http://schemas.microsoft.com/office/word/2016/wordml/cid" xmlns:w16="http://schemas.microsoft.com/office/word/2018/wordml" xmlns:w16du="http://schemas.microsoft.com/office/word/2023/wordml/word16du" xmlns:w16sdtdh="http://schemas.microsoft.com/office/word/2020/wordml/sdtdatahash" xmlns:w16sdtfl="http://schemas.microsoft.com/office/word/2024/wordml/sdtformatlock" xmlns:w16se="http://schemas.microsoft.com/office/word/2015/wordml/symex" xmlns:wpg="http://schemas.microsoft.com/office/word/2010/wordprocessingGroup" xmlns:wpi="http://schemas.microsoft.com/office/word/2010/wordprocessingInk" xmlns:wne="http://schemas.microsoft.com/office/word/2006/wordml" xmlns:wps="http://schemas.microsoft.com/office/word/2010/wordprocessingShape" mc:Ignorable="w14 w15 w16se w16cid w16 w16cex w16sdtdh w16sdtfl w16du wp14">
+<w:numbering xmlns:wpc="http://schemas.microsoft.com/office/word/2010/wordprocessingCanvas" xmlns:cx="http://schemas.microsoft.com/office/drawing/2014/chartex" xmlns:cx1="http://schemas.microsoft.com/office/drawing/2015/9/8/chartex" xmlns:cx2="http://schemas.microsoft.com/office/drawing/2015/10/21/chartex" xmlns:cx3="http://schemas.microsoft.com/office/drawing/2016/5/9/chartex" xmlns:cx4="http://schemas.microsoft.com/office/drawing/2016/5/10/chartex" xmlns:cx5="http://schemas.microsoft.com/office/drawing/2016/5/11/chartex" xmlns:cx6="http://schemas.microsoft.com/office/drawing/2016/5/12/chartex" xmlns:cx7="http://schemas.microsoft.com/office/drawing/2016/5/13/chartex" xmlns:cx8="http://schemas.microsoft.com/office/drawing/2016/5/14/chartex" xmlns:mc="http://schemas.openxmlformats.org/markup-compatibility/2006" xmlns:aink="http://schemas.microsoft.com/office/drawing/2016/ink" xmlns:am3d="http://schemas.microsoft.com/office/drawing/2017/model3d" xmlns:o="urn:schemas-microsoft-com:office:office" xmlns:oel="http://schemas.microsoft.com/office/2019/extlst" xmlns:r="http://schemas.openxmlformats.org/officeDocument/2006/relationships" xmlns:m="http://schemas.openxmlformats.org/officeDocument/2006/math" xmlns:v="urn:schemas-microsoft-com:vml" xmlns:wp14="http://schemas.microsoft.com/office/word/2010/wordprocessingDrawing" xmlns:wp="http://schemas.openxmlformats.org/drawingml/2006/wordprocessingDrawing" xmlns:w10="urn:schemas-microsoft-com:office:word" xmlns:w="http://schemas.openxmlformats.org/wordprocessingml/2006/main" xmlns:w14="http://schemas.microsoft.com/office/word/2010/wordml" xmlns:w15="http://schemas.microsoft.com/office/word/2012/wordml" xmlns:w16cex="http://schemas.microsoft.com/office/word/2018/wordml/cex" xmlns:w16cid="http://schemas.microsoft.com/office/word/2016/wordml/cid" xmlns:w16="http://schemas.microsoft.com/office/word/2018/wordml" xmlns:w16du="http://schemas.microsoft.com/office/word/2023/wordml/word16du" xmlns:w16sdtdh="http://schemas.microsoft.com/office/word/2020/wordml/sdtdatahash" xmlns:w16sdtfl="http://schemas.microsoft.com/office/word/2024/wordml/sdtformatlock" xmlns:w16se="http://schemas.microsoft.com/office/word/2015/wordml/symex" xmlns:wpg="http://schemas.microsoft.com/office/word/2010/wordprocessingGroup" xmlns:wpi="http://schemas.microsoft.com/office/word/2010/wordprocessingInk" xmlns:wne="http://schemas.microsoft.com/office/word/2006/wordml" xmlns:wps="http://schemas.microsoft.com/office/word/2010/wordprocessingShape" mc:Ignorable="w14 w15 w16se w16cid w16 w16cex w16sdtdh w16sdtfl w16du wp14">
   <w:abstractNum w:abstractNumId="0" w15:restartNumberingAfterBreak="0">
     <w:nsid w:val="05786DED"/>
     <w:multiLevelType w:val="hybridMultilevel"/>

</xml_diff>

<commit_message>
End the AHRQ R18 Co-I role at 2025; award no longer current support
Brian's Co-Investigator role on AHRQ R18 HS029474 ended with his 2025
move to UC San Diego, and the award's funding was withdrawn in 2026.

- CV and NIH biosketch: date column 2024 - 2025; CV text says
  "awarded 04/2024" instead of the 04/2024-03/2027 project period
- CV PDF re-exported (11 pages)
- NSF current-and-pending worksheet: R18 moved to the closed-awards
  table with its public-record citations; only the pending NSF proposal
  remains as an entry; UNC OSP questions removed; docx/PDF rebuilt
- NSF synergistic activities draft: item 5 now (2024-2025); PDF still
  one page
- NSF guide: award listed as not reportable; checklist updated

The biosketch worksheet is left uncommitted while Brian edits it.

Co-Authored-By: Claude Fable 5.1 <noreply@anthropic.com>
</commit_message>
<xml_diff>
--- a/Clincal_CV/BMAnderson CV.docx
+++ b/Clincal_CV/BMAnderson CV.docx
@@ -310,7 +310,7 @@
         <w:rPr>
           <w:rFonts w:ascii="Times New Roman" w:hAnsi="Times New Roman"/>
         </w:rPr>
-        <w:t>2024 – 2027</w:t>
+        <w:t>2024 – 2025</w:t>
       </w:r>
       <w:r>
         <w:rPr>
@@ -331,7 +331,7 @@
           <w:rFonts w:ascii="Times New Roman" w:hAnsi="Times New Roman" w:cs="Times New Roman"/>
           <w:color w:val="000000" w:themeColor="text1"/>
         </w:rPr>
-        <w:t>: AHRQ R18 Research Demonstration and Dissemination Project, Development and Assessment of Artificial Intelligence (AI)-Enhanced Pre-treatment Peer-review Process to Improve Patient Safety in Radiation Oncology, 04/2024 – 03/2027, $1,345,650 total (PIs L. Mazur and L. B. Marks). Leading the development of artificial intelligence strategies for improving patient safety and plan quality in radiation oncology. Facilitating the implementation of useful tools for low- and middle-income groups. Efficacy of AI assisted sim review in rural settings: randomized control study</w:t>
+        <w:t>: AHRQ R18 Research Demonstration and Dissemination Project, Development and Assessment of Artificial Intelligence (AI)-Enhanced Pre-treatment Peer-review Process to Improve Patient Safety in Radiation Oncology, awarded 04/2024, $1,345,650 total (PIs L. Mazur and L. B. Marks). Leading the development of artificial intelligence strategies for improving patient safety and plan quality in radiation oncology. Facilitating the implementation of useful tools for low- and middle-income groups. Efficacy of AI assisted sim review in rural settings: randomized control study</w:t>
       </w:r>
     </w:p>
     <w:p>

</xml_diff>